<commit_message>
AppIcon added, Permissions Request refactored, Toggle for LIVE detect added
</commit_message>
<xml_diff>
--- a/documentatie.docx
+++ b/documentatie.docx
@@ -3475,6 +3475,69 @@
     </w:p>
     <w:p>
       <w:pPr>
+        <w:rPr>
+          <w:lang w:val="ro-RO"/>
+        </w:rPr>
+      </w:pPr>
+      <w:r>
+        <w:rPr>
+          <w:lang w:val="ro-RO"/>
+        </w:rPr>
+        <w:t>Într-o lume în care digitalizarea își pune amprenta pe toate aspectele vieții noastre, capacitatea de a capta și analiza imagini devine esențială. Fotografiile nu sunt doar amintiri; ele sunt o sursă bogată de informații și context despre lumea din jurul nostru</w:t>
+      </w:r>
+      <w:r>
+        <w:rPr>
+          <w:lang w:val="ro-RO"/>
+        </w:rPr>
+        <w:t>, iar aplicația</w:t>
+      </w:r>
+      <w:r>
+        <w:rPr>
+          <w:lang w:val="ro-RO"/>
+        </w:rPr>
+        <w:t xml:space="preserve"> </w:t>
+      </w:r>
+      <w:proofErr w:type="spellStart"/>
+      <w:r>
+        <w:rPr>
+          <w:lang w:val="ro-RO"/>
+        </w:rPr>
+        <w:t>PhotoDex</w:t>
+      </w:r>
+      <w:proofErr w:type="spellEnd"/>
+      <w:r>
+        <w:rPr>
+          <w:lang w:val="ro-RO"/>
+        </w:rPr>
+        <w:t xml:space="preserve"> </w:t>
+      </w:r>
+      <w:r>
+        <w:rPr>
+          <w:lang w:val="ro-RO"/>
+        </w:rPr>
+        <w:t>propune</w:t>
+      </w:r>
+      <w:r>
+        <w:rPr>
+          <w:lang w:val="ro-RO"/>
+        </w:rPr>
+        <w:t xml:space="preserve"> să îmbunătățească această interacțiune prin utilizarea tehnologiilor avansate</w:t>
+      </w:r>
+      <w:r>
+        <w:rPr>
+          <w:lang w:val="ro-RO"/>
+        </w:rPr>
+        <w:t xml:space="preserve"> de analiză computațională</w:t>
+      </w:r>
+      <w:r>
+        <w:rPr>
+          <w:lang w:val="ro-RO"/>
+        </w:rPr>
+        <w:t xml:space="preserve"> pentru detectarea și analiza obiectelor direct pe dispozitivele iOS. În acest capitol, vom explora importanța și complexitatea acestor tehnologii, precum și impactul lor asupra utilizatorilor.</w:t>
+      </w:r>
+    </w:p>
+    <w:p>
+      <w:pPr>
         <w:pStyle w:val="Heading2"/>
         <w:numPr>
           <w:ilvl w:val="1"/>
@@ -3504,31 +3567,33 @@
         <w:rPr>
           <w:lang w:val="ro-RO"/>
         </w:rPr>
-        <w:t>Î</w:t>
-      </w:r>
-      <w:r>
-        <w:rPr>
-          <w:lang w:val="ro-RO"/>
-        </w:rPr>
-        <w:t>n contextul digitalizării rapide, procesarea imaginilor și detectarea obiectelor au devenit domenii de interes major atât în cercetare, cât și în aplicațiile comerciale</w:t>
-      </w:r>
-      <w:r>
-        <w:rPr>
-          <w:lang w:val="ro-RO"/>
-        </w:rPr>
-        <w:t xml:space="preserve"> iar f</w:t>
-      </w:r>
-      <w:r>
-        <w:rPr>
-          <w:lang w:val="ro-RO"/>
-        </w:rPr>
-        <w:t>otografiile, în special cele realizate cu telefoanele mobile, au devenit un instrument omniprezent de documentare a vieții cotidiene. Totuși, interpretarea corectă și rapidă a conținutului acestor imagini rămâne o provocare. În multe situații, utilizatorii întâmpină dificultăți în identificarea rapidă și precisă a obiectelor din fotografii, ceea ce poate duce la pierderi de timp și efort. Problemele de interpretare subiectivă și variabilitatea în calitatea imaginilor adaugă un nivel suplimentar de complexitate acestei provocări</w:t>
-      </w:r>
-      <w:r>
-        <w:rPr>
-          <w:lang w:val="ro-RO"/>
-        </w:rPr>
-        <w:t>, provocare pe care o vom aborda în implementarea soluției propuse de această lucrare.</w:t>
+        <w:t>Fotografiile capturate cu telefoanele mobile sunt omniprezente în documentarea evenimentelor cotidiene. Fie că imortalizăm momente personale, documentăm evenimente sau explorăm medii noi, imaginile joacă un rol crucial în viața noastră digitală. Cu toate acestea, capacitatea noastră de a analiza și interpreta rapid aceste imagini rămâne limitată</w:t>
+      </w:r>
+      <w:r>
+        <w:rPr>
+          <w:lang w:val="ro-RO"/>
+        </w:rPr>
+        <w:t>, iar aici</w:t>
+      </w:r>
+      <w:r>
+        <w:rPr>
+          <w:lang w:val="ro-RO"/>
+        </w:rPr>
+        <w:t xml:space="preserve"> intervine </w:t>
+      </w:r>
+      <w:proofErr w:type="spellStart"/>
+      <w:r>
+        <w:rPr>
+          <w:lang w:val="ro-RO"/>
+        </w:rPr>
+        <w:t>PhotoDex</w:t>
+      </w:r>
+      <w:proofErr w:type="spellEnd"/>
+      <w:r>
+        <w:rPr>
+          <w:lang w:val="ro-RO"/>
+        </w:rPr>
+        <w:t>, care folosește tehnologiile de detectare și analiză a obiectelor pentru a îmbunătăți această experiență.</w:t>
       </w:r>
     </w:p>
     <w:p>
@@ -3656,7 +3721,14 @@
         <w:rPr>
           <w:lang w:val="ro-RO"/>
         </w:rPr>
-        <w:t xml:space="preserve"> o precizie și o viteză superioare comparativ cu metodele tradiționale</w:t>
+        <w:t xml:space="preserve"> o precizie </w:t>
+      </w:r>
+      <w:r>
+        <w:rPr>
+          <w:lang w:val="ro-RO"/>
+        </w:rPr>
+        <w:lastRenderedPageBreak/>
+        <w:t>și o viteză superioare comparativ cu metodele tradiționale</w:t>
       </w:r>
       <w:r>
         <w:rPr>
@@ -3701,14 +3773,7 @@
         <w:rPr>
           <w:lang w:val="en-RO"/>
         </w:rPr>
-        <w:t xml:space="preserve"> Sistemele de conducere autonomă utilizează tehnologiile de procesare a imaginilor pentru a detecta și interpreta semnele de circulație, pietonii, </w:t>
-      </w:r>
-      <w:r>
-        <w:rPr>
-          <w:lang w:val="en-RO"/>
-        </w:rPr>
-        <w:lastRenderedPageBreak/>
-        <w:t xml:space="preserve">alte vehicule și obstacolele. Tesla și Waymo sunt printre companiile care folosesc intens aceste tehnologii pentru a dezvolta </w:t>
+        <w:t xml:space="preserve"> Sistemele de conducere autonomă utilizează tehnologiile de procesare a imaginilor pentru a detecta și interpreta semnele de circulație, pietonii, alte vehicule și obstacolele. Tesla și Waymo sunt printre companiile care folosesc intens aceste tehnologii pentru a dezvolta </w:t>
       </w:r>
       <w:r>
         <w:rPr>
@@ -3922,6 +3987,7 @@
         <w:rPr>
           <w:lang w:val="ro-RO"/>
         </w:rPr>
+        <w:lastRenderedPageBreak/>
         <w:t>Machine</w:t>
       </w:r>
       <w:proofErr w:type="spellEnd"/>
@@ -4025,14 +4091,7 @@
         <w:rPr>
           <w:lang w:val="ro-RO"/>
         </w:rPr>
-        <w:t xml:space="preserve"> actuale a utilizatorilor, dar și promovează </w:t>
-      </w:r>
-      <w:r>
-        <w:rPr>
-          <w:lang w:val="ro-RO"/>
-        </w:rPr>
-        <w:lastRenderedPageBreak/>
-        <w:t xml:space="preserve">utilizarea tehnologiilor avansate de </w:t>
+        <w:t xml:space="preserve"> actuale a utilizatorilor, dar și promovează utilizarea tehnologiilor avansate de </w:t>
       </w:r>
       <w:proofErr w:type="spellStart"/>
       <w:r>
@@ -4559,7 +4618,14 @@
         <w:rPr>
           <w:lang w:val="ro-RO"/>
         </w:rPr>
-        <w:t xml:space="preserve">. Un avantaj major al Swift este interoperabilitatea sa strânsă cu </w:t>
+        <w:t xml:space="preserve">. Un avantaj </w:t>
+      </w:r>
+      <w:r>
+        <w:rPr>
+          <w:lang w:val="ro-RO"/>
+        </w:rPr>
+        <w:lastRenderedPageBreak/>
+        <w:t xml:space="preserve">major al Swift este interoperabilitatea sa strânsă cu </w:t>
       </w:r>
       <w:proofErr w:type="spellStart"/>
       <w:r>
@@ -4634,7 +4700,6 @@
         <w:rPr>
           <w:lang w:val="ro-RO"/>
         </w:rPr>
-        <w:lastRenderedPageBreak/>
         <w:t xml:space="preserve">Astfel, în baza informațiilor prezentate legate de ecosistemul Apple și capabilitățile sale în ceea ce privește puterea computațională oferită de dispozitivele </w:t>
       </w:r>
       <w:r>
@@ -4880,7 +4945,14 @@
         <w:rPr>
           <w:lang w:val="ro-RO"/>
         </w:rPr>
-        <w:t>nfanții învață într-o mare măsură prin observație și interacțiune vizuală cu mediul lor. Aplicația poate fi folosită pentru a-i ajuta pe copii să învețe denumirile obiectelor din jurul lor prin identificarea și descrierea acestora într-un mod interactiv și educativ</w:t>
+        <w:t xml:space="preserve">nfanții învață într-o mare măsură prin observație și interacțiune vizuală cu mediul lor. Aplicația poate fi folosită pentru a-i ajuta pe copii să învețe denumirile obiectelor din jurul lor prin identificarea și descrierea acestora într-un mod interactiv </w:t>
+      </w:r>
+      <w:r>
+        <w:rPr>
+          <w:lang w:val="ro-RO"/>
+        </w:rPr>
+        <w:lastRenderedPageBreak/>
+        <w:t>și educativ</w:t>
       </w:r>
       <w:r>
         <w:rPr>
@@ -4911,7 +4983,6 @@
         <w:rPr>
           <w:lang w:val="ro-RO"/>
         </w:rPr>
-        <w:lastRenderedPageBreak/>
         <w:t>În acest sens, aplicația de asistență vizuală pe platforma iOS nu doar</w:t>
       </w:r>
       <w:r>
@@ -5093,7 +5164,14 @@
         <w:rPr>
           <w:lang w:val="ro-RO"/>
         </w:rPr>
-        <w:t xml:space="preserve">, în timp ce soluțiile de procesare ML și AI local, pe dispozitivul sursă, constituie metode mult mai sigure și de încredere, dar și mult mai potrivite pentru contextul utilizatorului, după cum propune și Apple cu lansarea platformei </w:t>
+        <w:t xml:space="preserve">, în timp ce soluțiile de procesare ML și AI local, pe dispozitivul sursă, constituie metode mult mai sigure și de încredere, dar și mult mai potrivite pentru contextul utilizatorului, după cum propune și Apple </w:t>
+      </w:r>
+      <w:r>
+        <w:rPr>
+          <w:lang w:val="ro-RO"/>
+        </w:rPr>
+        <w:lastRenderedPageBreak/>
+        <w:t xml:space="preserve">cu lansarea platformei </w:t>
       </w:r>
       <w:proofErr w:type="spellStart"/>
       <w:r>
@@ -5170,14 +5248,7 @@
         <w:rPr>
           <w:lang w:val="ro-RO"/>
         </w:rPr>
-        <w:t xml:space="preserve">-ul companiei doar datele esențiale pentru </w:t>
-      </w:r>
-      <w:r>
-        <w:rPr>
-          <w:lang w:val="ro-RO"/>
-        </w:rPr>
-        <w:lastRenderedPageBreak/>
-        <w:t xml:space="preserve">efectuarea analizei în cel mai scurt timp posibil </w:t>
+        <w:t xml:space="preserve">-ul companiei doar datele esențiale pentru efectuarea analizei în cel mai scurt timp posibil </w:t>
       </w:r>
       <w:sdt>
         <w:sdtPr>
@@ -10231,182 +10302,16 @@
     </w:p>
     <w:p>
       <w:pPr>
-        <w:rPr>
-          <w:lang w:val="ro-RO"/>
-        </w:rPr>
-      </w:pPr>
-      <w:r>
-        <w:rPr>
-          <w:lang w:val="ro-RO"/>
-        </w:rPr>
-        <w:t xml:space="preserve">Fluxul de prelucrare a imaginilor în </w:t>
-      </w:r>
-      <w:proofErr w:type="spellStart"/>
-      <w:r>
-        <w:rPr>
-          <w:lang w:val="ro-RO"/>
-        </w:rPr>
-        <w:t>PhotoDex</w:t>
-      </w:r>
-      <w:proofErr w:type="spellEnd"/>
-      <w:r>
-        <w:rPr>
-          <w:lang w:val="ro-RO"/>
-        </w:rPr>
-        <w:t xml:space="preserve"> include mai multe etape esențiale, de la capturarea imaginii până la afișarea rezultatelor finale utilizatorului. Aceste etape sunt concepute pentru a asigura o procesare rapidă și precisă a imaginilor, utilizând modelele YOLOv5 și MobileNetV2.</w:t>
-      </w:r>
-    </w:p>
-    <w:p>
-      <w:pPr>
-        <w:rPr>
-          <w:lang w:val="ro-RO"/>
-        </w:rPr>
-      </w:pPr>
-      <w:r>
+        <w:pStyle w:val="ListParagraph"/>
+        <w:numPr>
+          <w:ilvl w:val="0"/>
+          <w:numId w:val="31"/>
+        </w:numPr>
         <w:rPr>
           <w:b/>
           <w:bCs/>
           <w:lang w:val="ro-RO"/>
         </w:rPr>
-        <w:t>Capturarea sau Selectarea Imaginilor</w:t>
-      </w:r>
-      <w:r>
-        <w:rPr>
-          <w:lang w:val="ro-RO"/>
-        </w:rPr>
-        <w:t xml:space="preserve">: </w:t>
-      </w:r>
-      <w:r>
-        <w:rPr>
-          <w:lang w:val="ro-RO"/>
-        </w:rPr>
-        <w:t>Utilizatorii pot alege să captureze imagini noi folosind camera dispozitivului sau să selecteze imagini existente din galerie</w:t>
-      </w:r>
-      <w:r>
-        <w:rPr>
-          <w:lang w:val="ro-RO"/>
-        </w:rPr>
-        <w:t>, aspect ce oferă</w:t>
-      </w:r>
-      <w:r>
-        <w:rPr>
-          <w:lang w:val="ro-RO"/>
-        </w:rPr>
-        <w:t xml:space="preserve"> flexibilitate</w:t>
-      </w:r>
-      <w:r>
-        <w:rPr>
-          <w:lang w:val="ro-RO"/>
-        </w:rPr>
-        <w:t xml:space="preserve">, </w:t>
-      </w:r>
-      <w:r>
-        <w:rPr>
-          <w:lang w:val="ro-RO"/>
-        </w:rPr>
-        <w:t>permite aplicației să se adapteze la diferite scenarii de utilizare.</w:t>
-      </w:r>
-    </w:p>
-    <w:p>
-      <w:pPr>
-        <w:pStyle w:val="Coding"/>
-      </w:pPr>
-      <w:r>
-        <w:t xml:space="preserve">// Capturarea unei imagini utilizând </w:t>
-      </w:r>
-      <w:proofErr w:type="spellStart"/>
-      <w:r>
-        <w:t>CameraViewModel</w:t>
-      </w:r>
-      <w:proofErr w:type="spellEnd"/>
-    </w:p>
-    <w:p>
-      <w:pPr>
-        <w:pStyle w:val="Coding"/>
-      </w:pPr>
-      <w:proofErr w:type="spellStart"/>
-      <w:r>
-        <w:t>func</w:t>
-      </w:r>
-      <w:proofErr w:type="spellEnd"/>
-      <w:r>
-        <w:t xml:space="preserve"> </w:t>
-      </w:r>
-      <w:proofErr w:type="spellStart"/>
-      <w:r>
-        <w:t>captureImage</w:t>
-      </w:r>
-      <w:proofErr w:type="spellEnd"/>
-      <w:r>
-        <w:t>() {</w:t>
-      </w:r>
-    </w:p>
-    <w:p>
-      <w:pPr>
-        <w:pStyle w:val="Coding"/>
-      </w:pPr>
-      <w:r>
-        <w:t xml:space="preserve">    </w:t>
-      </w:r>
-      <w:proofErr w:type="spellStart"/>
-      <w:r>
-        <w:t>cameraManager.captureImage</w:t>
-      </w:r>
-      <w:proofErr w:type="spellEnd"/>
-      <w:r>
-        <w:t xml:space="preserve"> { </w:t>
-      </w:r>
-      <w:proofErr w:type="spellStart"/>
-      <w:r>
-        <w:t>image</w:t>
-      </w:r>
-      <w:proofErr w:type="spellEnd"/>
-      <w:r>
-        <w:t xml:space="preserve"> in</w:t>
-      </w:r>
-    </w:p>
-    <w:p>
-      <w:pPr>
-        <w:pStyle w:val="Coding"/>
-      </w:pPr>
-      <w:r>
-        <w:t xml:space="preserve">        </w:t>
-      </w:r>
-      <w:proofErr w:type="spellStart"/>
-      <w:r>
-        <w:t>self.capturedImage</w:t>
-      </w:r>
-      <w:proofErr w:type="spellEnd"/>
-      <w:r>
-        <w:t xml:space="preserve"> = </w:t>
-      </w:r>
-      <w:proofErr w:type="spellStart"/>
-      <w:r>
-        <w:t>image</w:t>
-      </w:r>
-      <w:proofErr w:type="spellEnd"/>
-    </w:p>
-    <w:p>
-      <w:pPr>
-        <w:pStyle w:val="Coding"/>
-      </w:pPr>
-      <w:r>
-        <w:t xml:space="preserve">    }</w:t>
-      </w:r>
-    </w:p>
-    <w:p>
-      <w:pPr>
-        <w:pStyle w:val="Coding"/>
-      </w:pPr>
-      <w:r>
-        <w:t>}</w:t>
-      </w:r>
-    </w:p>
-    <w:p>
-      <w:pPr>
-        <w:rPr>
-          <w:lang w:val="ro-RO"/>
-        </w:rPr>
       </w:pPr>
       <w:r>
         <w:rPr>
@@ -10414,347 +10319,562 @@
           <w:bCs/>
           <w:lang w:val="ro-RO"/>
         </w:rPr>
-        <w:t>Preprocesarea Imaginilor</w:t>
-      </w:r>
-      <w:r>
-        <w:rPr>
-          <w:lang w:val="ro-RO"/>
-        </w:rPr>
-        <w:t xml:space="preserve">: </w:t>
-      </w:r>
-      <w:r>
-        <w:rPr>
-          <w:lang w:val="ro-RO"/>
-        </w:rPr>
-        <w:t>Imaginile capturate sau selectate sunt redimensionate și convertite într-un format compatibil cu modelele ML</w:t>
-      </w:r>
-      <w:r>
-        <w:rPr>
-          <w:lang w:val="ro-RO"/>
-        </w:rPr>
-        <w:t xml:space="preserve"> (</w:t>
-      </w:r>
-      <w:proofErr w:type="spellStart"/>
-      <w:r>
-        <w:rPr>
-          <w:lang w:val="ro-RO"/>
-        </w:rPr>
-        <w:t>CVPixelBuffer</w:t>
-      </w:r>
-      <w:proofErr w:type="spellEnd"/>
-      <w:r>
-        <w:rPr>
-          <w:lang w:val="ro-RO"/>
-        </w:rPr>
-        <w:t>)</w:t>
-      </w:r>
-      <w:r>
-        <w:rPr>
-          <w:lang w:val="ro-RO"/>
-        </w:rPr>
-        <w:t xml:space="preserve">, </w:t>
-      </w:r>
-      <w:r>
-        <w:rPr>
-          <w:lang w:val="ro-RO"/>
-        </w:rPr>
-        <w:t>pregătind astfel setul de date pentru analiză.</w:t>
-      </w:r>
-    </w:p>
-    <w:p>
-      <w:pPr>
-        <w:pStyle w:val="Coding"/>
-      </w:pPr>
-      <w:r>
-        <w:t>// Conversia unei imagini într-un buffer de pixeli</w:t>
-      </w:r>
-    </w:p>
-    <w:p>
-      <w:pPr>
-        <w:pStyle w:val="Coding"/>
-      </w:pPr>
-      <w:proofErr w:type="spellStart"/>
-      <w:r>
-        <w:t>func</w:t>
-      </w:r>
-      <w:proofErr w:type="spellEnd"/>
-      <w:r>
-        <w:t xml:space="preserve"> </w:t>
-      </w:r>
-      <w:proofErr w:type="spellStart"/>
-      <w:r>
-        <w:t>convertToCVPixelBuffer</w:t>
-      </w:r>
-      <w:proofErr w:type="spellEnd"/>
-      <w:r>
-        <w:t>(</w:t>
-      </w:r>
-      <w:proofErr w:type="spellStart"/>
-      <w:r>
-        <w:t>image</w:t>
-      </w:r>
-      <w:proofErr w:type="spellEnd"/>
-      <w:r>
-        <w:t xml:space="preserve">: </w:t>
-      </w:r>
-      <w:proofErr w:type="spellStart"/>
-      <w:r>
-        <w:t>UIImage</w:t>
-      </w:r>
-      <w:proofErr w:type="spellEnd"/>
-      <w:r>
-        <w:t xml:space="preserve">) -&gt; </w:t>
-      </w:r>
-      <w:proofErr w:type="spellStart"/>
-      <w:r>
-        <w:t>CVPixelBuffer</w:t>
-      </w:r>
-      <w:proofErr w:type="spellEnd"/>
-      <w:r>
-        <w:t>? {</w:t>
-      </w:r>
-    </w:p>
-    <w:p>
-      <w:pPr>
-        <w:pStyle w:val="Coding"/>
-      </w:pPr>
-      <w:r>
-        <w:t xml:space="preserve">    // Logica de conversie</w:t>
-      </w:r>
-    </w:p>
-    <w:p>
-      <w:pPr>
-        <w:pStyle w:val="Coding"/>
-      </w:pPr>
-      <w:r>
-        <w:t xml:space="preserve">    // Crearea unui context de imagine compatibil cu Core ML</w:t>
-      </w:r>
-    </w:p>
-    <w:p>
-      <w:pPr>
-        <w:pStyle w:val="Coding"/>
-      </w:pPr>
-      <w:r>
-        <w:t>}</w:t>
-      </w:r>
-    </w:p>
-    <w:p>
-      <w:pPr>
-        <w:rPr>
-          <w:lang w:val="ro-RO"/>
-        </w:rPr>
-      </w:pPr>
+        <w:t xml:space="preserve">De </w:t>
+      </w:r>
+      <w:proofErr w:type="spellStart"/>
       <w:r>
         <w:rPr>
           <w:b/>
           <w:bCs/>
           <w:lang w:val="ro-RO"/>
         </w:rPr>
-        <w:t>Detecția Obiectelor cu YOLOv5</w:t>
-      </w:r>
-      <w:r>
-        <w:rPr>
-          <w:lang w:val="ro-RO"/>
-        </w:rPr>
-        <w:t xml:space="preserve">: </w:t>
-      </w:r>
-      <w:r>
-        <w:rPr>
-          <w:lang w:val="ro-RO"/>
-        </w:rPr>
-        <w:t>Modelul YOLOv5 este utilizat pentru a detecta și localiza obiectele din imagine. Aceasta este prima etapă de analiză, în care sunt identificate toate obiectele prezente în imagine.</w:t>
-      </w:r>
-    </w:p>
-    <w:p>
-      <w:pPr>
-        <w:pStyle w:val="Coding"/>
-      </w:pPr>
-      <w:r>
-        <w:t xml:space="preserve">// Crearea unui </w:t>
-      </w:r>
-      <w:proofErr w:type="spellStart"/>
-      <w:r>
-        <w:t>request</w:t>
-      </w:r>
-      <w:proofErr w:type="spellEnd"/>
-      <w:r>
-        <w:t xml:space="preserve"> YOLOv5 pentru detectarea obiectelor</w:t>
-      </w:r>
-    </w:p>
-    <w:p>
-      <w:pPr>
-        <w:pStyle w:val="Coding"/>
-      </w:pPr>
-      <w:proofErr w:type="spellStart"/>
-      <w:r>
-        <w:t>let</w:t>
-      </w:r>
-      <w:proofErr w:type="spellEnd"/>
-      <w:r>
-        <w:t xml:space="preserve"> </w:t>
-      </w:r>
-      <w:proofErr w:type="spellStart"/>
-      <w:r>
-        <w:t>yoloRequest</w:t>
-      </w:r>
-      <w:proofErr w:type="spellEnd"/>
-      <w:r>
-        <w:t xml:space="preserve"> = </w:t>
-      </w:r>
-      <w:proofErr w:type="spellStart"/>
-      <w:r>
-        <w:t>VNCoreMLRequest</w:t>
-      </w:r>
-      <w:proofErr w:type="spellEnd"/>
-      <w:r>
-        <w:t xml:space="preserve">(model: </w:t>
-      </w:r>
-      <w:proofErr w:type="spellStart"/>
-      <w:r>
-        <w:t>yoloModel</w:t>
-      </w:r>
-      <w:proofErr w:type="spellEnd"/>
-      <w:r>
-        <w:t xml:space="preserve">) { </w:t>
-      </w:r>
-      <w:proofErr w:type="spellStart"/>
-      <w:r>
-        <w:t>request</w:t>
-      </w:r>
-      <w:proofErr w:type="spellEnd"/>
-      <w:r>
-        <w:t xml:space="preserve">, </w:t>
-      </w:r>
-      <w:proofErr w:type="spellStart"/>
-      <w:r>
-        <w:t>error</w:t>
-      </w:r>
-      <w:proofErr w:type="spellEnd"/>
-      <w:r>
-        <w:t xml:space="preserve"> in</w:t>
-      </w:r>
-    </w:p>
-    <w:p>
-      <w:pPr>
-        <w:pStyle w:val="Coding"/>
-      </w:pPr>
-    </w:p>
-    <w:p>
-      <w:pPr>
-        <w:pStyle w:val="Coding"/>
-      </w:pPr>
-      <w:r>
-        <w:t xml:space="preserve">    // Procesarea </w:t>
-      </w:r>
-      <w:r>
-        <w:t>cadranelor de încadrare</w:t>
-      </w:r>
-      <w:r>
-        <w:t xml:space="preserve"> detectate</w:t>
-      </w:r>
-    </w:p>
-    <w:p>
-      <w:pPr>
-        <w:pStyle w:val="Coding"/>
-      </w:pPr>
-      <w:r>
-        <w:t xml:space="preserve">    guard </w:t>
-      </w:r>
-      <w:proofErr w:type="spellStart"/>
-      <w:r>
-        <w:t>let</w:t>
-      </w:r>
-      <w:proofErr w:type="spellEnd"/>
-      <w:r>
-        <w:t xml:space="preserve"> </w:t>
-      </w:r>
-      <w:proofErr w:type="spellStart"/>
-      <w:r>
-        <w:t>results</w:t>
-      </w:r>
-      <w:proofErr w:type="spellEnd"/>
-      <w:r>
-        <w:t xml:space="preserve"> = </w:t>
-      </w:r>
-      <w:proofErr w:type="spellStart"/>
-      <w:r>
-        <w:t>request.results</w:t>
-      </w:r>
-      <w:proofErr w:type="spellEnd"/>
-      <w:r>
-        <w:t xml:space="preserve"> as? [</w:t>
-      </w:r>
-      <w:proofErr w:type="spellStart"/>
-      <w:r>
-        <w:t>VNRecognizedObjectObservation</w:t>
-      </w:r>
-      <w:proofErr w:type="spellEnd"/>
-      <w:r>
-        <w:t xml:space="preserve">] </w:t>
-      </w:r>
-      <w:proofErr w:type="spellStart"/>
-      <w:r>
-        <w:t>else</w:t>
-      </w:r>
-      <w:proofErr w:type="spellEnd"/>
-      <w:r>
-        <w:t xml:space="preserve"> {</w:t>
-      </w:r>
-    </w:p>
-    <w:p>
-      <w:pPr>
-        <w:pStyle w:val="Coding"/>
-      </w:pPr>
-      <w:r>
-        <w:t xml:space="preserve">        </w:t>
-      </w:r>
-      <w:proofErr w:type="spellStart"/>
-      <w:r>
-        <w:t>return</w:t>
-      </w:r>
-      <w:proofErr w:type="spellEnd"/>
-    </w:p>
-    <w:p>
-      <w:pPr>
-        <w:pStyle w:val="Coding"/>
-      </w:pPr>
-      <w:r>
-        <w:t xml:space="preserve">    }</w:t>
-      </w:r>
-    </w:p>
-    <w:p>
-      <w:pPr>
-        <w:pStyle w:val="Coding"/>
-      </w:pPr>
-    </w:p>
-    <w:p>
-      <w:pPr>
-        <w:pStyle w:val="Coding"/>
-      </w:pPr>
-      <w:r>
-        <w:t xml:space="preserve">    // Extrage și gestionează obiectele detectate</w:t>
-      </w:r>
-    </w:p>
-    <w:p>
-      <w:pPr>
-        <w:pStyle w:val="Coding"/>
-      </w:pPr>
-      <w:r>
-        <w:t>}</w:t>
-      </w:r>
-    </w:p>
-    <w:p>
-      <w:pPr>
-        <w:rPr>
-          <w:lang w:val="ro-RO"/>
-        </w:rPr>
-      </w:pPr>
+        <w:t>adaugat</w:t>
+      </w:r>
+      <w:proofErr w:type="spellEnd"/>
       <w:r>
         <w:rPr>
           <w:b/>
           <w:bCs/>
           <w:lang w:val="ro-RO"/>
         </w:rPr>
+        <w:t xml:space="preserve"> diagrama</w:t>
+      </w:r>
+      <w:r>
+        <w:rPr>
+          <w:b/>
+          <w:bCs/>
+          <w:lang w:val="ro-RO"/>
+        </w:rPr>
+        <w:t xml:space="preserve"> de proces analizare prelucrare</w:t>
+      </w:r>
+    </w:p>
+    <w:p>
+      <w:pPr>
+        <w:rPr>
+          <w:lang w:val="ro-RO"/>
+        </w:rPr>
+      </w:pPr>
+      <w:r>
+        <w:rPr>
+          <w:lang w:val="ro-RO"/>
+        </w:rPr>
+        <w:t xml:space="preserve">Fluxul de prelucrare a imaginilor în </w:t>
+      </w:r>
+      <w:proofErr w:type="spellStart"/>
+      <w:r>
+        <w:rPr>
+          <w:lang w:val="ro-RO"/>
+        </w:rPr>
+        <w:t>PhotoDex</w:t>
+      </w:r>
+      <w:proofErr w:type="spellEnd"/>
+      <w:r>
+        <w:rPr>
+          <w:lang w:val="ro-RO"/>
+        </w:rPr>
+        <w:t xml:space="preserve"> include mai multe etape esențiale, de la capturarea imaginii până la afișarea rezultatelor finale utilizatorului. Aceste etape sunt concepute pentru a asigura o procesare rapidă și precisă a imaginilor, utilizând modelele YOLOv5 și MobileNetV2.</w:t>
+      </w:r>
+    </w:p>
+    <w:p>
+      <w:pPr>
+        <w:rPr>
+          <w:lang w:val="ro-RO"/>
+        </w:rPr>
+      </w:pPr>
+      <w:r>
+        <w:rPr>
+          <w:b/>
+          <w:bCs/>
+          <w:lang w:val="ro-RO"/>
+        </w:rPr>
+        <w:t>Capturarea sau Selectarea Imaginilor</w:t>
+      </w:r>
+      <w:r>
+        <w:rPr>
+          <w:lang w:val="ro-RO"/>
+        </w:rPr>
+        <w:t xml:space="preserve">: </w:t>
+      </w:r>
+      <w:r>
+        <w:rPr>
+          <w:lang w:val="ro-RO"/>
+        </w:rPr>
+        <w:t>Utilizatorii pot alege să captureze imagini noi folosind camera dispozitivului sau să selecteze imagini existente din galerie</w:t>
+      </w:r>
+      <w:r>
+        <w:rPr>
+          <w:lang w:val="ro-RO"/>
+        </w:rPr>
+        <w:t>, aspect ce oferă</w:t>
+      </w:r>
+      <w:r>
+        <w:rPr>
+          <w:lang w:val="ro-RO"/>
+        </w:rPr>
+        <w:t xml:space="preserve"> flexibilitate</w:t>
+      </w:r>
+      <w:r>
+        <w:rPr>
+          <w:lang w:val="ro-RO"/>
+        </w:rPr>
+        <w:t xml:space="preserve">, </w:t>
+      </w:r>
+      <w:r>
+        <w:rPr>
+          <w:lang w:val="ro-RO"/>
+        </w:rPr>
+        <w:t>permite aplicației să se adapteze la diferite scenarii de utilizare.</w:t>
+      </w:r>
+    </w:p>
+    <w:p>
+      <w:pPr>
+        <w:pStyle w:val="Coding"/>
+      </w:pPr>
+      <w:r>
+        <w:t xml:space="preserve">// Capturarea unei imagini utilizând </w:t>
+      </w:r>
+      <w:proofErr w:type="spellStart"/>
+      <w:r>
+        <w:t>CameraViewModel</w:t>
+      </w:r>
+      <w:proofErr w:type="spellEnd"/>
+    </w:p>
+    <w:p>
+      <w:pPr>
+        <w:pStyle w:val="Coding"/>
+      </w:pPr>
+      <w:proofErr w:type="spellStart"/>
+      <w:r>
+        <w:t>func</w:t>
+      </w:r>
+      <w:proofErr w:type="spellEnd"/>
+      <w:r>
+        <w:t xml:space="preserve"> </w:t>
+      </w:r>
+      <w:proofErr w:type="spellStart"/>
+      <w:r>
+        <w:t>captureImage</w:t>
+      </w:r>
+      <w:proofErr w:type="spellEnd"/>
+      <w:r>
+        <w:t>() {</w:t>
+      </w:r>
+    </w:p>
+    <w:p>
+      <w:pPr>
+        <w:pStyle w:val="Coding"/>
+      </w:pPr>
+      <w:r>
+        <w:t xml:space="preserve">    </w:t>
+      </w:r>
+      <w:proofErr w:type="spellStart"/>
+      <w:r>
+        <w:t>cameraManager.captureImage</w:t>
+      </w:r>
+      <w:proofErr w:type="spellEnd"/>
+      <w:r>
+        <w:t xml:space="preserve"> { </w:t>
+      </w:r>
+      <w:proofErr w:type="spellStart"/>
+      <w:r>
+        <w:t>image</w:t>
+      </w:r>
+      <w:proofErr w:type="spellEnd"/>
+      <w:r>
+        <w:t xml:space="preserve"> in</w:t>
+      </w:r>
+    </w:p>
+    <w:p>
+      <w:pPr>
+        <w:pStyle w:val="Coding"/>
+      </w:pPr>
+      <w:r>
+        <w:t xml:space="preserve">        </w:t>
+      </w:r>
+      <w:proofErr w:type="spellStart"/>
+      <w:r>
+        <w:t>self.capturedImage</w:t>
+      </w:r>
+      <w:proofErr w:type="spellEnd"/>
+      <w:r>
+        <w:t xml:space="preserve"> = </w:t>
+      </w:r>
+      <w:proofErr w:type="spellStart"/>
+      <w:r>
+        <w:t>image</w:t>
+      </w:r>
+      <w:proofErr w:type="spellEnd"/>
+    </w:p>
+    <w:p>
+      <w:pPr>
+        <w:pStyle w:val="Coding"/>
+      </w:pPr>
+      <w:r>
+        <w:t xml:space="preserve">    }</w:t>
+      </w:r>
+    </w:p>
+    <w:p>
+      <w:pPr>
+        <w:pStyle w:val="Coding"/>
+      </w:pPr>
+      <w:r>
+        <w:t>}</w:t>
+      </w:r>
+    </w:p>
+    <w:p>
+      <w:pPr>
+        <w:rPr>
+          <w:lang w:val="ro-RO"/>
+        </w:rPr>
+      </w:pPr>
+      <w:r>
+        <w:rPr>
+          <w:b/>
+          <w:bCs/>
+          <w:lang w:val="ro-RO"/>
+        </w:rPr>
+        <w:t>Preprocesarea Imaginilor</w:t>
+      </w:r>
+      <w:r>
+        <w:rPr>
+          <w:lang w:val="ro-RO"/>
+        </w:rPr>
+        <w:t xml:space="preserve">: </w:t>
+      </w:r>
+      <w:r>
+        <w:rPr>
+          <w:lang w:val="ro-RO"/>
+        </w:rPr>
+        <w:t>Imaginile capturate sau selectate sunt redimensionate și convertite într-un format compatibil cu modelele ML</w:t>
+      </w:r>
+      <w:r>
+        <w:rPr>
+          <w:lang w:val="ro-RO"/>
+        </w:rPr>
+        <w:t xml:space="preserve"> (</w:t>
+      </w:r>
+      <w:proofErr w:type="spellStart"/>
+      <w:r>
+        <w:rPr>
+          <w:lang w:val="ro-RO"/>
+        </w:rPr>
+        <w:t>CVPixelBuffer</w:t>
+      </w:r>
+      <w:proofErr w:type="spellEnd"/>
+      <w:r>
+        <w:rPr>
+          <w:lang w:val="ro-RO"/>
+        </w:rPr>
+        <w:t>)</w:t>
+      </w:r>
+      <w:r>
+        <w:rPr>
+          <w:lang w:val="ro-RO"/>
+        </w:rPr>
+        <w:t xml:space="preserve">, </w:t>
+      </w:r>
+      <w:r>
+        <w:rPr>
+          <w:lang w:val="ro-RO"/>
+        </w:rPr>
+        <w:t>pregătind astfel setul de date pentru analiză.</w:t>
+      </w:r>
+    </w:p>
+    <w:p>
+      <w:pPr>
+        <w:pStyle w:val="Coding"/>
+      </w:pPr>
+      <w:r>
+        <w:t>// Conversia unei imagini într-un buffer de pixeli</w:t>
+      </w:r>
+    </w:p>
+    <w:p>
+      <w:pPr>
+        <w:pStyle w:val="Coding"/>
+      </w:pPr>
+      <w:proofErr w:type="spellStart"/>
+      <w:r>
+        <w:t>func</w:t>
+      </w:r>
+      <w:proofErr w:type="spellEnd"/>
+      <w:r>
+        <w:t xml:space="preserve"> </w:t>
+      </w:r>
+      <w:proofErr w:type="spellStart"/>
+      <w:r>
+        <w:t>convertToCVPixelBuffer</w:t>
+      </w:r>
+      <w:proofErr w:type="spellEnd"/>
+      <w:r>
+        <w:t>(</w:t>
+      </w:r>
+      <w:proofErr w:type="spellStart"/>
+      <w:r>
+        <w:t>image</w:t>
+      </w:r>
+      <w:proofErr w:type="spellEnd"/>
+      <w:r>
+        <w:t xml:space="preserve">: </w:t>
+      </w:r>
+      <w:proofErr w:type="spellStart"/>
+      <w:r>
+        <w:t>UIImage</w:t>
+      </w:r>
+      <w:proofErr w:type="spellEnd"/>
+      <w:r>
+        <w:t xml:space="preserve">) -&gt; </w:t>
+      </w:r>
+      <w:proofErr w:type="spellStart"/>
+      <w:r>
+        <w:t>CVPixelBuffer</w:t>
+      </w:r>
+      <w:proofErr w:type="spellEnd"/>
+      <w:r>
+        <w:t>? {</w:t>
+      </w:r>
+    </w:p>
+    <w:p>
+      <w:pPr>
+        <w:pStyle w:val="Coding"/>
+      </w:pPr>
+      <w:r>
+        <w:t xml:space="preserve">    // Logica de conversie</w:t>
+      </w:r>
+    </w:p>
+    <w:p>
+      <w:pPr>
+        <w:pStyle w:val="Coding"/>
+      </w:pPr>
+      <w:r>
+        <w:t xml:space="preserve">    // Crearea unui context de imagine compatibil cu Core ML</w:t>
+      </w:r>
+    </w:p>
+    <w:p>
+      <w:pPr>
+        <w:pStyle w:val="Coding"/>
+      </w:pPr>
+      <w:r>
+        <w:t>}</w:t>
+      </w:r>
+    </w:p>
+    <w:p>
+      <w:pPr>
+        <w:rPr>
+          <w:lang w:val="ro-RO"/>
+        </w:rPr>
+      </w:pPr>
+      <w:r>
+        <w:rPr>
+          <w:b/>
+          <w:bCs/>
+          <w:lang w:val="ro-RO"/>
+        </w:rPr>
+        <w:t>Detecția Obiectelor cu YOLOv5</w:t>
+      </w:r>
+      <w:r>
+        <w:rPr>
+          <w:lang w:val="ro-RO"/>
+        </w:rPr>
+        <w:t xml:space="preserve">: </w:t>
+      </w:r>
+      <w:r>
+        <w:rPr>
+          <w:lang w:val="ro-RO"/>
+        </w:rPr>
+        <w:t>Modelul YOLOv5 este utilizat pentru a detecta și localiza obiectele din imagine. Aceasta este prima etapă de analiză, în care sunt identificate toate obiectele prezente în imagine.</w:t>
+      </w:r>
+    </w:p>
+    <w:p>
+      <w:pPr>
+        <w:pStyle w:val="Coding"/>
+      </w:pPr>
+      <w:r>
+        <w:t xml:space="preserve">// Crearea unui </w:t>
+      </w:r>
+      <w:proofErr w:type="spellStart"/>
+      <w:r>
+        <w:t>request</w:t>
+      </w:r>
+      <w:proofErr w:type="spellEnd"/>
+      <w:r>
+        <w:t xml:space="preserve"> YOLOv5 pentru detectarea obiectelor</w:t>
+      </w:r>
+    </w:p>
+    <w:p>
+      <w:pPr>
+        <w:pStyle w:val="Coding"/>
+      </w:pPr>
+      <w:proofErr w:type="spellStart"/>
+      <w:r>
+        <w:t>let</w:t>
+      </w:r>
+      <w:proofErr w:type="spellEnd"/>
+      <w:r>
+        <w:t xml:space="preserve"> </w:t>
+      </w:r>
+      <w:proofErr w:type="spellStart"/>
+      <w:r>
+        <w:t>yoloRequest</w:t>
+      </w:r>
+      <w:proofErr w:type="spellEnd"/>
+      <w:r>
+        <w:t xml:space="preserve"> = </w:t>
+      </w:r>
+      <w:proofErr w:type="spellStart"/>
+      <w:r>
+        <w:t>VNCoreMLRequest</w:t>
+      </w:r>
+      <w:proofErr w:type="spellEnd"/>
+      <w:r>
+        <w:t xml:space="preserve">(model: </w:t>
+      </w:r>
+      <w:proofErr w:type="spellStart"/>
+      <w:r>
+        <w:t>yoloModel</w:t>
+      </w:r>
+      <w:proofErr w:type="spellEnd"/>
+      <w:r>
+        <w:t xml:space="preserve">) { </w:t>
+      </w:r>
+      <w:proofErr w:type="spellStart"/>
+      <w:r>
+        <w:t>request</w:t>
+      </w:r>
+      <w:proofErr w:type="spellEnd"/>
+      <w:r>
+        <w:t xml:space="preserve">, </w:t>
+      </w:r>
+      <w:proofErr w:type="spellStart"/>
+      <w:r>
+        <w:t>error</w:t>
+      </w:r>
+      <w:proofErr w:type="spellEnd"/>
+      <w:r>
+        <w:t xml:space="preserve"> in</w:t>
+      </w:r>
+    </w:p>
+    <w:p>
+      <w:pPr>
+        <w:pStyle w:val="Coding"/>
+      </w:pPr>
+    </w:p>
+    <w:p>
+      <w:pPr>
+        <w:pStyle w:val="Coding"/>
+      </w:pPr>
+      <w:r>
+        <w:t xml:space="preserve">    // Procesarea </w:t>
+      </w:r>
+      <w:r>
+        <w:t>cadranelor de încadrare</w:t>
+      </w:r>
+      <w:r>
+        <w:t xml:space="preserve"> detectate</w:t>
+      </w:r>
+    </w:p>
+    <w:p>
+      <w:pPr>
+        <w:pStyle w:val="Coding"/>
+      </w:pPr>
+      <w:r>
+        <w:t xml:space="preserve">    guard </w:t>
+      </w:r>
+      <w:proofErr w:type="spellStart"/>
+      <w:r>
+        <w:t>let</w:t>
+      </w:r>
+      <w:proofErr w:type="spellEnd"/>
+      <w:r>
+        <w:t xml:space="preserve"> </w:t>
+      </w:r>
+      <w:proofErr w:type="spellStart"/>
+      <w:r>
+        <w:t>results</w:t>
+      </w:r>
+      <w:proofErr w:type="spellEnd"/>
+      <w:r>
+        <w:t xml:space="preserve"> = </w:t>
+      </w:r>
+      <w:proofErr w:type="spellStart"/>
+      <w:r>
+        <w:t>request.results</w:t>
+      </w:r>
+      <w:proofErr w:type="spellEnd"/>
+      <w:r>
+        <w:t xml:space="preserve"> as? [</w:t>
+      </w:r>
+      <w:proofErr w:type="spellStart"/>
+      <w:r>
+        <w:t>VNRecognizedObjectObservation</w:t>
+      </w:r>
+      <w:proofErr w:type="spellEnd"/>
+      <w:r>
+        <w:t xml:space="preserve">] </w:t>
+      </w:r>
+      <w:proofErr w:type="spellStart"/>
+      <w:r>
+        <w:t>else</w:t>
+      </w:r>
+      <w:proofErr w:type="spellEnd"/>
+      <w:r>
+        <w:t xml:space="preserve"> {</w:t>
+      </w:r>
+    </w:p>
+    <w:p>
+      <w:pPr>
+        <w:pStyle w:val="Coding"/>
+      </w:pPr>
+      <w:r>
+        <w:t xml:space="preserve">        </w:t>
+      </w:r>
+      <w:proofErr w:type="spellStart"/>
+      <w:r>
+        <w:t>return</w:t>
+      </w:r>
+      <w:proofErr w:type="spellEnd"/>
+    </w:p>
+    <w:p>
+      <w:pPr>
+        <w:pStyle w:val="Coding"/>
+      </w:pPr>
+      <w:r>
+        <w:t xml:space="preserve">    }</w:t>
+      </w:r>
+    </w:p>
+    <w:p>
+      <w:pPr>
+        <w:pStyle w:val="Coding"/>
+      </w:pPr>
+    </w:p>
+    <w:p>
+      <w:pPr>
+        <w:pStyle w:val="Coding"/>
+      </w:pPr>
+      <w:r>
+        <w:t xml:space="preserve">    // Extrage și gestionează obiectele detectate</w:t>
+      </w:r>
+    </w:p>
+    <w:p>
+      <w:pPr>
+        <w:pStyle w:val="Coding"/>
+      </w:pPr>
+      <w:r>
+        <w:t>}</w:t>
+      </w:r>
+    </w:p>
+    <w:p>
+      <w:pPr>
+        <w:rPr>
+          <w:lang w:val="ro-RO"/>
+        </w:rPr>
+      </w:pPr>
+      <w:r>
+        <w:rPr>
+          <w:b/>
+          <w:bCs/>
+          <w:lang w:val="ro-RO"/>
+        </w:rPr>
+        <w:lastRenderedPageBreak/>
         <w:t>Clasificarea Obiectelor cu MobileNetV2</w:t>
       </w:r>
       <w:r>
@@ -10775,7 +10895,6 @@
         <w:pStyle w:val="Coding"/>
       </w:pPr>
       <w:r>
-        <w:lastRenderedPageBreak/>
         <w:t>// Clasificarea obiectelor detectate folosind MobileNetV2</w:t>
       </w:r>
     </w:p>
@@ -11314,6 +11433,210 @@
         <w:t>Concluzii</w:t>
       </w:r>
       <w:bookmarkEnd w:id="15"/>
+    </w:p>
+    <w:p>
+      <w:pPr>
+        <w:rPr>
+          <w:lang w:val="ro-RO"/>
+        </w:rPr>
+      </w:pPr>
+      <w:r>
+        <w:rPr>
+          <w:lang w:val="ro-RO"/>
+        </w:rPr>
+        <w:t>Acest capitol a detaliat utilizarea tehnologiilor și metodologiilor avansate în aplicația </w:t>
+      </w:r>
+      <w:r>
+        <w:rPr>
+          <w:lang w:val="ro-RO"/>
+        </w:rPr>
+        <w:t xml:space="preserve">propusă, </w:t>
+      </w:r>
+      <w:proofErr w:type="spellStart"/>
+      <w:r>
+        <w:rPr>
+          <w:lang w:val="ro-RO"/>
+        </w:rPr>
+        <w:t>PhotoDex</w:t>
+      </w:r>
+      <w:proofErr w:type="spellEnd"/>
+      <w:r>
+        <w:rPr>
+          <w:lang w:val="ro-RO"/>
+        </w:rPr>
+        <w:t xml:space="preserve">, </w:t>
+      </w:r>
+      <w:r>
+        <w:rPr>
+          <w:lang w:val="ro-RO"/>
+        </w:rPr>
+        <w:t xml:space="preserve"> pentru a oferi utilizatorilor o soluție performantă și precisă de detectare și clasificare a obiectelor. Integrarea eficientă a limbajului Swift și a </w:t>
+      </w:r>
+      <w:proofErr w:type="spellStart"/>
+      <w:r>
+        <w:rPr>
+          <w:lang w:val="ro-RO"/>
+        </w:rPr>
+        <w:t>framework</w:t>
+      </w:r>
+      <w:proofErr w:type="spellEnd"/>
+      <w:r>
+        <w:rPr>
+          <w:lang w:val="ro-RO"/>
+        </w:rPr>
+        <w:t xml:space="preserve">-urilor </w:t>
+      </w:r>
+      <w:proofErr w:type="spellStart"/>
+      <w:r>
+        <w:rPr>
+          <w:lang w:val="ro-RO"/>
+        </w:rPr>
+        <w:t>SwiftUI</w:t>
+      </w:r>
+      <w:proofErr w:type="spellEnd"/>
+      <w:r>
+        <w:rPr>
+          <w:lang w:val="ro-RO"/>
+        </w:rPr>
+        <w:t xml:space="preserve">, Core ML și Vision, împreună cu modelele YOLOv5 și MobileNetV2, demonstrează cum pot fi construite aplicații puternice și eficiente direct pe dispozitivele iOS. Această abordare deschide noi oportunități pentru inovații viitoare în domeniul inteligenței artificiale mobile și al </w:t>
+      </w:r>
+      <w:r>
+        <w:rPr>
+          <w:lang w:val="ro-RO"/>
+        </w:rPr>
+        <w:lastRenderedPageBreak/>
+        <w:t>procesării de imagini, asigurând o experiență de utilizare de înaltă calitate și respectând totodată intimitatea utilizatorilor.</w:t>
+      </w:r>
+    </w:p>
+    <w:p>
+      <w:pPr>
+        <w:rPr>
+          <w:lang w:val="ro-RO"/>
+        </w:rPr>
+      </w:pPr>
+    </w:p>
+    <w:p>
+      <w:pPr>
+        <w:rPr>
+          <w:lang w:val="ro-RO"/>
+        </w:rPr>
+      </w:pPr>
+      <w:r>
+        <w:rPr>
+          <w:lang w:val="ro-RO"/>
+        </w:rPr>
+        <w:t xml:space="preserve">TO DO: de </w:t>
+      </w:r>
+      <w:proofErr w:type="spellStart"/>
+      <w:r>
+        <w:rPr>
+          <w:lang w:val="ro-RO"/>
+        </w:rPr>
+        <w:t>cautat</w:t>
+      </w:r>
+      <w:proofErr w:type="spellEnd"/>
+      <w:r>
+        <w:rPr>
+          <w:lang w:val="ro-RO"/>
+        </w:rPr>
+        <w:t xml:space="preserve"> </w:t>
+      </w:r>
+      <w:proofErr w:type="spellStart"/>
+      <w:r>
+        <w:rPr>
+          <w:lang w:val="ro-RO"/>
+        </w:rPr>
+        <w:t>features</w:t>
+      </w:r>
+      <w:proofErr w:type="spellEnd"/>
+      <w:r>
+        <w:rPr>
+          <w:lang w:val="ro-RO"/>
+        </w:rPr>
+        <w:t xml:space="preserve"> de la Apple si de </w:t>
+      </w:r>
+      <w:proofErr w:type="spellStart"/>
+      <w:r>
+        <w:rPr>
+          <w:lang w:val="ro-RO"/>
+        </w:rPr>
+        <w:t>incercat</w:t>
+      </w:r>
+      <w:proofErr w:type="spellEnd"/>
+      <w:r>
+        <w:rPr>
+          <w:lang w:val="ro-RO"/>
+        </w:rPr>
+        <w:t xml:space="preserve"> sa implementez alte mecanisme  de procesare</w:t>
+      </w:r>
+    </w:p>
+    <w:p>
+      <w:pPr>
+        <w:rPr>
+          <w:lang w:val="ro-RO"/>
+        </w:rPr>
+      </w:pPr>
+    </w:p>
+    <w:p>
+      <w:pPr>
+        <w:rPr>
+          <w:lang w:val="ro-RO"/>
+        </w:rPr>
+      </w:pPr>
+      <w:r>
+        <w:rPr>
+          <w:lang w:val="ro-RO"/>
+        </w:rPr>
+        <w:t>Analiza descompunere si compunere de imagini:</w:t>
+      </w:r>
+    </w:p>
+    <w:p>
+      <w:pPr>
+        <w:rPr>
+          <w:lang w:val="ro-RO"/>
+        </w:rPr>
+      </w:pPr>
+      <w:r>
+        <w:rPr>
+          <w:lang w:val="ro-RO"/>
+        </w:rPr>
+        <w:t xml:space="preserve">Pixelii sunt </w:t>
+      </w:r>
+      <w:proofErr w:type="spellStart"/>
+      <w:r>
+        <w:rPr>
+          <w:lang w:val="ro-RO"/>
+        </w:rPr>
+        <w:t>inlocuiti</w:t>
+      </w:r>
+      <w:proofErr w:type="spellEnd"/>
+      <w:r>
+        <w:rPr>
+          <w:lang w:val="ro-RO"/>
+        </w:rPr>
+        <w:t xml:space="preserve"> de alte imagini </w:t>
+      </w:r>
+      <w:proofErr w:type="spellStart"/>
+      <w:r>
+        <w:rPr>
+          <w:lang w:val="ro-RO"/>
+        </w:rPr>
+        <w:t>zoomed</w:t>
+      </w:r>
+      <w:proofErr w:type="spellEnd"/>
+      <w:r>
+        <w:rPr>
+          <w:lang w:val="ro-RO"/>
+        </w:rPr>
+        <w:t xml:space="preserve"> out care </w:t>
+      </w:r>
+    </w:p>
+    <w:p>
+      <w:pPr>
+        <w:rPr>
+          <w:lang w:val="ro-RO"/>
+        </w:rPr>
+      </w:pPr>
     </w:p>
     <w:p>
       <w:pPr>
@@ -11333,50 +11656,86 @@
         <w:rPr>
           <w:lang w:val="ro-RO"/>
         </w:rPr>
-        <w:t>Acest capitol a detaliat utilizarea tehnologiilor și metodologiilor avansate în aplicația </w:t>
-      </w:r>
-      <w:proofErr w:type="spellStart"/>
-      <w:r>
-        <w:rPr>
-          <w:lang w:val="ro-RO"/>
-        </w:rPr>
-        <w:t>PhotoDex</w:t>
-      </w:r>
-      <w:proofErr w:type="spellEnd"/>
-      <w:r>
-        <w:rPr>
-          <w:lang w:val="ro-RO"/>
-        </w:rPr>
-        <w:t xml:space="preserve"> pentru a oferi utilizatorilor o soluție performantă și precisă de detectare și clasificare a obiectelor. Integrarea eficientă a limbajului Swift și a </w:t>
-      </w:r>
-      <w:proofErr w:type="spellStart"/>
-      <w:r>
-        <w:rPr>
-          <w:lang w:val="ro-RO"/>
-        </w:rPr>
-        <w:t>framework</w:t>
-      </w:r>
-      <w:proofErr w:type="spellEnd"/>
-      <w:r>
-        <w:rPr>
-          <w:lang w:val="ro-RO"/>
-        </w:rPr>
-        <w:t xml:space="preserve">-urilor </w:t>
-      </w:r>
-      <w:proofErr w:type="spellStart"/>
-      <w:r>
-        <w:rPr>
-          <w:lang w:val="ro-RO"/>
-        </w:rPr>
-        <w:t>SwiftUI</w:t>
-      </w:r>
-      <w:proofErr w:type="spellEnd"/>
-      <w:r>
-        <w:rPr>
-          <w:lang w:val="ro-RO"/>
-        </w:rPr>
-        <w:t>, Core ML și Vision, împreună cu modelele YOLOv5 și MobileNetV2, demonstrează cum pot fi construite aplicații puternice și eficiente direct pe dispozitivele iOS. Această abordare deschide noi oportunități pentru inovații viitoare în domeniul inteligenței artificiale mobile și al procesării de imagini, asigurând o experiență de utilizare de înaltă calitate și respectând totodată intimitatea utilizatorilor.</w:t>
-      </w:r>
+        <w:t xml:space="preserve"> Body </w:t>
+      </w:r>
+      <w:proofErr w:type="spellStart"/>
+      <w:r>
+        <w:rPr>
+          <w:lang w:val="ro-RO"/>
+        </w:rPr>
+        <w:t>and</w:t>
+      </w:r>
+      <w:proofErr w:type="spellEnd"/>
+      <w:r>
+        <w:rPr>
+          <w:lang w:val="ro-RO"/>
+        </w:rPr>
+        <w:t xml:space="preserve"> </w:t>
+      </w:r>
+      <w:proofErr w:type="spellStart"/>
+      <w:r>
+        <w:rPr>
+          <w:lang w:val="ro-RO"/>
+        </w:rPr>
+        <w:t>pose</w:t>
+      </w:r>
+      <w:proofErr w:type="spellEnd"/>
+      <w:r>
+        <w:rPr>
+          <w:lang w:val="ro-RO"/>
+        </w:rPr>
+        <w:t xml:space="preserve"> </w:t>
+      </w:r>
+      <w:proofErr w:type="spellStart"/>
+      <w:r>
+        <w:rPr>
+          <w:lang w:val="ro-RO"/>
+        </w:rPr>
+        <w:t>detection</w:t>
+      </w:r>
+      <w:proofErr w:type="spellEnd"/>
+      <w:r>
+        <w:rPr>
+          <w:lang w:val="ro-RO"/>
+        </w:rPr>
+        <w:t xml:space="preserve"> </w:t>
+      </w:r>
+      <w:proofErr w:type="spellStart"/>
+      <w:r>
+        <w:rPr>
+          <w:lang w:val="ro-RO"/>
+        </w:rPr>
+        <w:t>and</w:t>
+      </w:r>
+      <w:proofErr w:type="spellEnd"/>
+      <w:r>
+        <w:rPr>
+          <w:lang w:val="ro-RO"/>
+        </w:rPr>
+        <w:t xml:space="preserve"> </w:t>
+      </w:r>
+      <w:proofErr w:type="spellStart"/>
+      <w:r>
+        <w:rPr>
+          <w:lang w:val="ro-RO"/>
+        </w:rPr>
+        <w:t>animation</w:t>
+      </w:r>
+      <w:proofErr w:type="spellEnd"/>
+      <w:r>
+        <w:rPr>
+          <w:lang w:val="ro-RO"/>
+        </w:rPr>
+        <w:t xml:space="preserve"> </w:t>
+      </w:r>
+      <w:proofErr w:type="spellStart"/>
+      <w:r>
+        <w:rPr>
+          <w:lang w:val="ro-RO"/>
+        </w:rPr>
+        <w:t>overlay</w:t>
+      </w:r>
+      <w:proofErr w:type="spellEnd"/>
     </w:p>
     <w:bookmarkStart w:id="16" w:name="_Toc169827532" w:displacedByCustomXml="next"/>
     <w:sdt>
@@ -14977,6 +15336,119 @@
     </w:lvl>
   </w:abstractNum>
   <w:abstractNum w:abstractNumId="25" w15:restartNumberingAfterBreak="0">
+    <w:nsid w:val="644871A2"/>
+    <w:multiLevelType w:val="hybridMultilevel"/>
+    <w:tmpl w:val="DCE4C776"/>
+    <w:lvl w:ilvl="0" w:tplc="68D8A4EE">
+      <w:start w:val="2"/>
+      <w:numFmt w:val="bullet"/>
+      <w:lvlText w:val="-"/>
+      <w:lvlJc w:val="left"/>
+      <w:pPr>
+        <w:ind w:left="1080" w:hanging="360"/>
+      </w:pPr>
+      <w:rPr>
+        <w:rFonts w:ascii="Times New Roman" w:eastAsiaTheme="minorHAnsi" w:hAnsi="Times New Roman" w:cs="Times New Roman" w:hint="default"/>
+      </w:rPr>
+    </w:lvl>
+    <w:lvl w:ilvl="1" w:tplc="08090003" w:tentative="1">
+      <w:start w:val="1"/>
+      <w:numFmt w:val="bullet"/>
+      <w:lvlText w:val="o"/>
+      <w:lvlJc w:val="left"/>
+      <w:pPr>
+        <w:ind w:left="1800" w:hanging="360"/>
+      </w:pPr>
+      <w:rPr>
+        <w:rFonts w:ascii="Courier New" w:hAnsi="Courier New" w:cs="Courier New" w:hint="default"/>
+      </w:rPr>
+    </w:lvl>
+    <w:lvl w:ilvl="2" w:tplc="08090005" w:tentative="1">
+      <w:start w:val="1"/>
+      <w:numFmt w:val="bullet"/>
+      <w:lvlText w:val=""/>
+      <w:lvlJc w:val="left"/>
+      <w:pPr>
+        <w:ind w:left="2520" w:hanging="360"/>
+      </w:pPr>
+      <w:rPr>
+        <w:rFonts w:ascii="Wingdings" w:hAnsi="Wingdings" w:hint="default"/>
+      </w:rPr>
+    </w:lvl>
+    <w:lvl w:ilvl="3" w:tplc="08090001" w:tentative="1">
+      <w:start w:val="1"/>
+      <w:numFmt w:val="bullet"/>
+      <w:lvlText w:val=""/>
+      <w:lvlJc w:val="left"/>
+      <w:pPr>
+        <w:ind w:left="3240" w:hanging="360"/>
+      </w:pPr>
+      <w:rPr>
+        <w:rFonts w:ascii="Symbol" w:hAnsi="Symbol" w:hint="default"/>
+      </w:rPr>
+    </w:lvl>
+    <w:lvl w:ilvl="4" w:tplc="08090003" w:tentative="1">
+      <w:start w:val="1"/>
+      <w:numFmt w:val="bullet"/>
+      <w:lvlText w:val="o"/>
+      <w:lvlJc w:val="left"/>
+      <w:pPr>
+        <w:ind w:left="3960" w:hanging="360"/>
+      </w:pPr>
+      <w:rPr>
+        <w:rFonts w:ascii="Courier New" w:hAnsi="Courier New" w:cs="Courier New" w:hint="default"/>
+      </w:rPr>
+    </w:lvl>
+    <w:lvl w:ilvl="5" w:tplc="08090005" w:tentative="1">
+      <w:start w:val="1"/>
+      <w:numFmt w:val="bullet"/>
+      <w:lvlText w:val=""/>
+      <w:lvlJc w:val="left"/>
+      <w:pPr>
+        <w:ind w:left="4680" w:hanging="360"/>
+      </w:pPr>
+      <w:rPr>
+        <w:rFonts w:ascii="Wingdings" w:hAnsi="Wingdings" w:hint="default"/>
+      </w:rPr>
+    </w:lvl>
+    <w:lvl w:ilvl="6" w:tplc="08090001" w:tentative="1">
+      <w:start w:val="1"/>
+      <w:numFmt w:val="bullet"/>
+      <w:lvlText w:val=""/>
+      <w:lvlJc w:val="left"/>
+      <w:pPr>
+        <w:ind w:left="5400" w:hanging="360"/>
+      </w:pPr>
+      <w:rPr>
+        <w:rFonts w:ascii="Symbol" w:hAnsi="Symbol" w:hint="default"/>
+      </w:rPr>
+    </w:lvl>
+    <w:lvl w:ilvl="7" w:tplc="08090003" w:tentative="1">
+      <w:start w:val="1"/>
+      <w:numFmt w:val="bullet"/>
+      <w:lvlText w:val="o"/>
+      <w:lvlJc w:val="left"/>
+      <w:pPr>
+        <w:ind w:left="6120" w:hanging="360"/>
+      </w:pPr>
+      <w:rPr>
+        <w:rFonts w:ascii="Courier New" w:hAnsi="Courier New" w:cs="Courier New" w:hint="default"/>
+      </w:rPr>
+    </w:lvl>
+    <w:lvl w:ilvl="8" w:tplc="08090005" w:tentative="1">
+      <w:start w:val="1"/>
+      <w:numFmt w:val="bullet"/>
+      <w:lvlText w:val=""/>
+      <w:lvlJc w:val="left"/>
+      <w:pPr>
+        <w:ind w:left="6840" w:hanging="360"/>
+      </w:pPr>
+      <w:rPr>
+        <w:rFonts w:ascii="Wingdings" w:hAnsi="Wingdings" w:hint="default"/>
+      </w:rPr>
+    </w:lvl>
+  </w:abstractNum>
+  <w:abstractNum w:abstractNumId="26" w15:restartNumberingAfterBreak="0">
     <w:nsid w:val="668B336F"/>
     <w:multiLevelType w:val="multilevel"/>
     <w:tmpl w:val="DD605D02"/>
@@ -15125,7 +15597,7 @@
       </w:rPr>
     </w:lvl>
   </w:abstractNum>
-  <w:abstractNum w:abstractNumId="26" w15:restartNumberingAfterBreak="0">
+  <w:abstractNum w:abstractNumId="27" w15:restartNumberingAfterBreak="0">
     <w:nsid w:val="68560406"/>
     <w:multiLevelType w:val="multilevel"/>
     <w:tmpl w:val="0409001F"/>
@@ -15211,7 +15683,7 @@
       </w:pPr>
     </w:lvl>
   </w:abstractNum>
-  <w:abstractNum w:abstractNumId="27" w15:restartNumberingAfterBreak="0">
+  <w:abstractNum w:abstractNumId="28" w15:restartNumberingAfterBreak="0">
     <w:nsid w:val="6CD90967"/>
     <w:multiLevelType w:val="multilevel"/>
     <w:tmpl w:val="0409001F"/>
@@ -15297,7 +15769,7 @@
       </w:pPr>
     </w:lvl>
   </w:abstractNum>
-  <w:abstractNum w:abstractNumId="28" w15:restartNumberingAfterBreak="0">
+  <w:abstractNum w:abstractNumId="29" w15:restartNumberingAfterBreak="0">
     <w:nsid w:val="718B3EE5"/>
     <w:multiLevelType w:val="multilevel"/>
     <w:tmpl w:val="0409001F"/>
@@ -15383,7 +15855,7 @@
       </w:pPr>
     </w:lvl>
   </w:abstractNum>
-  <w:abstractNum w:abstractNumId="29" w15:restartNumberingAfterBreak="0">
+  <w:abstractNum w:abstractNumId="30" w15:restartNumberingAfterBreak="0">
     <w:nsid w:val="75DE1C73"/>
     <w:multiLevelType w:val="multilevel"/>
     <w:tmpl w:val="27A651AC"/>
@@ -15482,13 +15954,13 @@
     <w:abstractNumId w:val="16"/>
   </w:num>
   <w:num w:numId="3" w16cid:durableId="259409219">
-    <w:abstractNumId w:val="27"/>
+    <w:abstractNumId w:val="28"/>
   </w:num>
   <w:num w:numId="4" w16cid:durableId="1396512798">
     <w:abstractNumId w:val="23"/>
   </w:num>
   <w:num w:numId="5" w16cid:durableId="1496725076">
-    <w:abstractNumId w:val="26"/>
+    <w:abstractNumId w:val="27"/>
   </w:num>
   <w:num w:numId="6" w16cid:durableId="119760992">
     <w:abstractNumId w:val="0"/>
@@ -15509,7 +15981,7 @@
     <w:abstractNumId w:val="14"/>
   </w:num>
   <w:num w:numId="12" w16cid:durableId="748505736">
-    <w:abstractNumId w:val="29"/>
+    <w:abstractNumId w:val="30"/>
   </w:num>
   <w:num w:numId="13" w16cid:durableId="1312828506">
     <w:abstractNumId w:val="18"/>
@@ -15536,7 +16008,7 @@
     <w:abstractNumId w:val="19"/>
   </w:num>
   <w:num w:numId="21" w16cid:durableId="1445929811">
-    <w:abstractNumId w:val="28"/>
+    <w:abstractNumId w:val="29"/>
   </w:num>
   <w:num w:numId="22" w16cid:durableId="192883423">
     <w:abstractNumId w:val="24"/>
@@ -15557,13 +16029,16 @@
     <w:abstractNumId w:val="5"/>
   </w:num>
   <w:num w:numId="28" w16cid:durableId="950741013">
-    <w:abstractNumId w:val="25"/>
+    <w:abstractNumId w:val="26"/>
   </w:num>
   <w:num w:numId="29" w16cid:durableId="460272538">
     <w:abstractNumId w:val="22"/>
   </w:num>
   <w:num w:numId="30" w16cid:durableId="2131315958">
     <w:abstractNumId w:val="1"/>
+  </w:num>
+  <w:num w:numId="31" w16cid:durableId="1439638517">
+    <w:abstractNumId w:val="25"/>
   </w:num>
 </w:numbering>
 </file>

</xml_diff>